<commit_message>
Expand Rentora QA suite: search matrix, validation & boundary tests, reports
Add SearchActions and data-driven test matrices (search, form-validation,
boundary/equivalence), expand testcases, refresh report generation, and
include bug/recommendation reports plus evidence screenshots.

Co-Authored-By: Claude Opus 4.8 <noreply@anthropic.com>
</commit_message>
<xml_diff>
--- a/docreport/Rentora-Test-Report.docx
+++ b/docreport/Rentora-Test-Report.docx
@@ -43,7 +43,7 @@
           <w:sz w:val="20"/>
           <w:szCs w:val="20"/>
         </w:rPr>
-        <w:t xml:space="preserve">Prepared by QA Automation (Playwright + Playwright-MCP) · 24 Jun 2026</w:t>
+        <w:t xml:space="preserve">Prepared by QA Automation (Playwright + Playwright-MCP) · 26 Jun 2026</w:t>
       </w:r>
     </w:p>
     <w:p>
@@ -60,7 +60,7 @@
         <w:spacing w:after="80"/>
       </w:pPr>
       <w:r>
-        <w:t xml:space="preserve">Rentora is a three-portal rental marketplace (public renter site, owner portal, admin portal). The application was analysed live with Playwright-MCP across all roles (guest, renter, owner, admin), and 58 test cases were designed from the observed behaviour. 39 were automated and executed this run; the remaining 19 are documented manual/E2E cases. Testing uncovered 3 distinct defects, two of which (registration crash and debug-mode disclosure) are release-blocking.</w:t>
+        <w:t xml:space="preserve">Rentora is a three-portal rental marketplace (public renter site, owner portal, admin portal). The application was analysed live with Playwright-MCP across all roles (guest, renter, owner, admin), and 182 test cases were designed from the observed behaviour. 163 were automated and executed this run; the remaining 19 are documented manual/E2E cases. This cycle expanded the suite with a data-driven Boundary-Value-Analysis (BVA) and Equivalence-Partitioning (EP) matrix over the /search filters and the /register &amp; /login validation (115 automated EP/BVA/edge cases, 115 passing), with every expected value pinned to live seed data — confirming the platform handles input boundaries and partitions robustly. Testing uncovered 4 distinct defects, two of which (registration crash and debug-mode disclosure) are release-blocking.</w:t>
       </w:r>
     </w:p>
     <w:tbl>
@@ -133,7 +133,7 @@
                 <w:b w:val="false"/>
                 <w:bCs w:val="false"/>
               </w:rPr>
-              <w:t xml:space="preserve">58</w:t>
+              <w:t xml:space="preserve">182</w:t>
             </w:r>
           </w:p>
         </w:tc>
@@ -157,7 +157,7 @@
                 <w:b w:val="false"/>
                 <w:bCs w:val="false"/>
               </w:rPr>
-              <w:t xml:space="preserve">39</w:t>
+              <w:t xml:space="preserve">163</w:t>
             </w:r>
           </w:p>
         </w:tc>
@@ -183,7 +183,7 @@
                 <w:bCs/>
                 <w:color w:val="2E7D32"/>
               </w:rPr>
-              <w:t xml:space="preserve">34</w:t>
+              <w:t xml:space="preserve">160</w:t>
             </w:r>
           </w:p>
         </w:tc>
@@ -209,7 +209,7 @@
                 <w:bCs/>
                 <w:color w:val="C62828"/>
               </w:rPr>
-              <w:t xml:space="preserve">5</w:t>
+              <w:t xml:space="preserve">3</w:t>
             </w:r>
           </w:p>
         </w:tc>
@@ -281,7 +281,7 @@
                 <w:b/>
                 <w:bCs/>
               </w:rPr>
-              <w:t xml:space="preserve">3</w:t>
+              <w:t xml:space="preserve">4</w:t>
             </w:r>
           </w:p>
         </w:tc>
@@ -296,7 +296,7 @@
           <w:b/>
           <w:bCs/>
         </w:rPr>
-        <w:t xml:space="preserve">Automated pass rate: 87% (34/39).</w:t>
+        <w:t xml:space="preserve">Automated pass rate: 98% (160/163).</w:t>
       </w:r>
     </w:p>
     <w:p>
@@ -406,6 +406,32 @@
       </w:pPr>
       <w:r>
         <w:t xml:space="preserve">Security — contact-PII gating, error-page information disclosure</w:t>
+      </w:r>
+    </w:p>
+    <w:p>
+      <w:pPr>
+        <w:pStyle w:val="ListParagraph"/>
+        <w:numPr>
+          <w:ilvl w:val="0"/>
+          <w:numId w:val="1"/>
+        </w:numPr>
+        <w:spacing w:after="40"/>
+      </w:pPr>
+      <w:r>
+        <w:t xml:space="preserve">Boundary &amp; equivalence (data-driven matrix) — /search price min/max boundaries (inclusive/exclusive across all 8 seeded rents), bedrooms / property-type / for-whom / furnishing / amenity (×27) / combined-filter partitions, and inverted/negative/non-numeric edge inputs</w:t>
+      </w:r>
+    </w:p>
+    <w:p>
+      <w:pPr>
+        <w:pStyle w:val="ListParagraph"/>
+        <w:numPr>
+          <w:ilvl w:val="0"/>
+          <w:numId w:val="1"/>
+        </w:numPr>
+        <w:spacing w:after="40"/>
+      </w:pPr>
+      <w:r>
+        <w:t xml:space="preserve">Form validation — /register field EP/BVA (name, email-format classes, BD phone-format &amp; length, password min-8) and /login negatives (empty, invalid-format, wrong/non-existent credentials, SQL-injection string, over-long input). 115 automated BVA/EP/edge cases total, 115 passing</w:t>
       </w:r>
     </w:p>
     <w:p>
@@ -632,7 +658,7 @@
                 <w:bCs w:val="false"/>
                 <w:color w:val="2E7D32"/>
               </w:rPr>
-              <w:t xml:space="preserve">0</w:t>
+              <w:t xml:space="preserve">10</w:t>
             </w:r>
           </w:p>
         </w:tc>
@@ -644,7 +670,7 @@
                 <w:bCs w:val="false"/>
                 <w:color w:val="C62828"/>
               </w:rPr>
-              <w:t xml:space="preserve">2</w:t>
+              <w:t xml:space="preserve">1</w:t>
             </w:r>
           </w:p>
         </w:tc>
@@ -691,7 +717,7 @@
                 <w:bCs w:val="false"/>
                 <w:color w:val="2E7D32"/>
               </w:rPr>
-              <w:t xml:space="preserve">0</w:t>
+              <w:t xml:space="preserve">9</w:t>
             </w:r>
           </w:p>
         </w:tc>
@@ -808,7 +834,7 @@
                 <w:bCs w:val="false"/>
                 <w:color w:val="2E7D32"/>
               </w:rPr>
-              <w:t xml:space="preserve">0</w:t>
+              <w:t xml:space="preserve">5</w:t>
             </w:r>
           </w:p>
         </w:tc>
@@ -866,7 +892,7 @@
                 <w:bCs w:val="false"/>
                 <w:color w:val="2E7D32"/>
               </w:rPr>
-              <w:t xml:space="preserve">0</w:t>
+              <w:t xml:space="preserve">6</w:t>
             </w:r>
           </w:p>
         </w:tc>
@@ -924,7 +950,7 @@
                 <w:bCs w:val="false"/>
                 <w:color w:val="2E7D32"/>
               </w:rPr>
-              <w:t xml:space="preserve">0</w:t>
+              <w:t xml:space="preserve">4</w:t>
             </w:r>
           </w:p>
         </w:tc>
@@ -982,19 +1008,192 @@
                 <w:bCs w:val="false"/>
                 <w:color w:val="2E7D32"/>
               </w:rPr>
+              <w:t xml:space="preserve">2</w:t>
+            </w:r>
+          </w:p>
+        </w:tc>
+        <w:tc>
+          <w:p>
+            <w:r>
+              <w:rPr>
+                <w:b w:val="false"/>
+                <w:bCs w:val="false"/>
+              </w:rPr>
               <w:t xml:space="preserve">0</w:t>
             </w:r>
           </w:p>
         </w:tc>
-        <w:tc>
-          <w:p>
-            <w:r>
-              <w:rPr>
-                <w:b w:val="false"/>
-                <w:bCs w:val="false"/>
-                <w:color w:val="C62828"/>
-              </w:rPr>
-              <w:t xml:space="preserve">1</w:t>
+      </w:tr>
+      <w:tr>
+        <w:tc>
+          <w:p>
+            <w:r>
+              <w:rPr>
+                <w:b w:val="false"/>
+                <w:bCs w:val="false"/>
+              </w:rPr>
+              <w:t xml:space="preserve">BoundaryEquivalence</w:t>
+            </w:r>
+          </w:p>
+        </w:tc>
+        <w:tc>
+          <w:p>
+            <w:r>
+              <w:rPr>
+                <w:b w:val="false"/>
+                <w:bCs w:val="false"/>
+              </w:rPr>
+              <w:t xml:space="preserve">21</w:t>
+            </w:r>
+          </w:p>
+        </w:tc>
+        <w:tc>
+          <w:p>
+            <w:r>
+              <w:rPr>
+                <w:b w:val="false"/>
+                <w:bCs w:val="false"/>
+              </w:rPr>
+              <w:t xml:space="preserve">21</w:t>
+            </w:r>
+          </w:p>
+        </w:tc>
+        <w:tc>
+          <w:p>
+            <w:r>
+              <w:rPr>
+                <w:b w:val="false"/>
+                <w:bCs w:val="false"/>
+                <w:color w:val="2E7D32"/>
+              </w:rPr>
+              <w:t xml:space="preserve">21</w:t>
+            </w:r>
+          </w:p>
+        </w:tc>
+        <w:tc>
+          <w:p>
+            <w:r>
+              <w:rPr>
+                <w:b w:val="false"/>
+                <w:bCs w:val="false"/>
+              </w:rPr>
+              <w:t xml:space="preserve">0</w:t>
+            </w:r>
+          </w:p>
+        </w:tc>
+      </w:tr>
+      <w:tr>
+        <w:tc>
+          <w:p>
+            <w:r>
+              <w:rPr>
+                <w:b w:val="false"/>
+                <w:bCs w:val="false"/>
+              </w:rPr>
+              <w:t xml:space="preserve">SearchMatrix</w:t>
+            </w:r>
+          </w:p>
+        </w:tc>
+        <w:tc>
+          <w:p>
+            <w:r>
+              <w:rPr>
+                <w:b w:val="false"/>
+                <w:bCs w:val="false"/>
+              </w:rPr>
+              <w:t xml:space="preserve">80</w:t>
+            </w:r>
+          </w:p>
+        </w:tc>
+        <w:tc>
+          <w:p>
+            <w:r>
+              <w:rPr>
+                <w:b w:val="false"/>
+                <w:bCs w:val="false"/>
+              </w:rPr>
+              <w:t xml:space="preserve">80</w:t>
+            </w:r>
+          </w:p>
+        </w:tc>
+        <w:tc>
+          <w:p>
+            <w:r>
+              <w:rPr>
+                <w:b w:val="false"/>
+                <w:bCs w:val="false"/>
+                <w:color w:val="2E7D32"/>
+              </w:rPr>
+              <w:t xml:space="preserve">80</w:t>
+            </w:r>
+          </w:p>
+        </w:tc>
+        <w:tc>
+          <w:p>
+            <w:r>
+              <w:rPr>
+                <w:b w:val="false"/>
+                <w:bCs w:val="false"/>
+              </w:rPr>
+              <w:t xml:space="preserve">0</w:t>
+            </w:r>
+          </w:p>
+        </w:tc>
+      </w:tr>
+      <w:tr>
+        <w:tc>
+          <w:p>
+            <w:r>
+              <w:rPr>
+                <w:b w:val="false"/>
+                <w:bCs w:val="false"/>
+              </w:rPr>
+              <w:t xml:space="preserve">FormValidation</w:t>
+            </w:r>
+          </w:p>
+        </w:tc>
+        <w:tc>
+          <w:p>
+            <w:r>
+              <w:rPr>
+                <w:b w:val="false"/>
+                <w:bCs w:val="false"/>
+              </w:rPr>
+              <w:t xml:space="preserve">23</w:t>
+            </w:r>
+          </w:p>
+        </w:tc>
+        <w:tc>
+          <w:p>
+            <w:r>
+              <w:rPr>
+                <w:b w:val="false"/>
+                <w:bCs w:val="false"/>
+              </w:rPr>
+              <w:t xml:space="preserve">23</w:t>
+            </w:r>
+          </w:p>
+        </w:tc>
+        <w:tc>
+          <w:p>
+            <w:r>
+              <w:rPr>
+                <w:b w:val="false"/>
+                <w:bCs w:val="false"/>
+                <w:color w:val="2E7D32"/>
+              </w:rPr>
+              <w:t xml:space="preserve">23</w:t>
+            </w:r>
+          </w:p>
+        </w:tc>
+        <w:tc>
+          <w:p>
+            <w:r>
+              <w:rPr>
+                <w:b w:val="false"/>
+                <w:bCs w:val="false"/>
+              </w:rPr>
+              <w:t xml:space="preserve">0</w:t>
             </w:r>
           </w:p>
         </w:tc>
@@ -1965,380 +2164,719 @@
     </w:p>
     <w:p>
       <w:pPr>
-        <w:pStyle w:val="Heading1"/>
-        <w:spacing w:after="120" w:before="240"/>
-      </w:pPr>
-      <w:r>
-        <w:t xml:space="preserve">4. Improvement Recommendations</w:t>
-      </w:r>
-    </w:p>
-    <w:p>
-      <w:pPr>
-        <w:pStyle w:val="Heading2"/>
-        <w:spacing w:after="120" w:before="240"/>
-      </w:pPr>
-      <w:r>
-        <w:t xml:space="preserve">UX Improvements</w:t>
-      </w:r>
-    </w:p>
-    <w:p>
-      <w:pPr>
-        <w:pStyle w:val="ListParagraph"/>
-        <w:numPr>
-          <w:ilvl w:val="0"/>
-          <w:numId w:val="1"/>
-        </w:numPr>
-        <w:spacing w:after="40"/>
-      </w:pPr>
-      <w:r>
-        <w:t xml:space="preserve">Show inline, field-level validation messages on register/login instead of relying on full-page reloads.</w:t>
-      </w:r>
-    </w:p>
-    <w:p>
-      <w:pPr>
-        <w:pStyle w:val="ListParagraph"/>
-        <w:numPr>
-          <w:ilvl w:val="0"/>
-          <w:numId w:val="1"/>
-        </w:numPr>
-        <w:spacing w:after="40"/>
-      </w:pPr>
-      <w:r>
-        <w:t xml:space="preserve">Provide a visible empty-state and active-filter chips on /search so users understand why results changed.</w:t>
-      </w:r>
-    </w:p>
-    <w:p>
-      <w:pPr>
-        <w:pStyle w:val="ListParagraph"/>
-        <w:numPr>
-          <w:ilvl w:val="0"/>
-          <w:numId w:val="1"/>
-        </w:numPr>
-        <w:spacing w:after="40"/>
-      </w:pPr>
-      <w:r>
-        <w:t xml:space="preserve">Surface the property 'views' counter and 'available from' date more prominently on cards.</w:t>
-      </w:r>
-    </w:p>
-    <w:p>
-      <w:pPr>
-        <w:pStyle w:val="Heading2"/>
-        <w:spacing w:after="120" w:before="240"/>
-      </w:pPr>
-      <w:r>
-        <w:t xml:space="preserve">Workflow Improvements</w:t>
-      </w:r>
-    </w:p>
-    <w:p>
-      <w:pPr>
-        <w:pStyle w:val="ListParagraph"/>
-        <w:numPr>
-          <w:ilvl w:val="0"/>
-          <w:numId w:val="1"/>
-        </w:numPr>
-        <w:spacing w:after="40"/>
-      </w:pPr>
-      <w:r>
-        <w:t xml:space="preserve">Decouple email sending from the registration transaction — queue the verification email so a mail failure never blocks account creation (fixes BUG-001's blast radius).</w:t>
-      </w:r>
-    </w:p>
-    <w:p>
-      <w:pPr>
-        <w:pStyle w:val="ListParagraph"/>
-        <w:numPr>
-          <w:ilvl w:val="0"/>
-          <w:numId w:val="1"/>
-        </w:numPr>
-        <w:spacing w:after="40"/>
-      </w:pPr>
-      <w:r>
-        <w:t xml:space="preserve">Allow renters limited browsing before email verification; gate only owner-contact actions behind verification.</w:t>
-      </w:r>
-    </w:p>
-    <w:p>
-      <w:pPr>
-        <w:pStyle w:val="ListParagraph"/>
-        <w:numPr>
-          <w:ilvl w:val="0"/>
-          <w:numId w:val="1"/>
-        </w:numPr>
-        <w:spacing w:after="40"/>
-      </w:pPr>
-      <w:r>
-        <w:t xml:space="preserve">Add a 'save &amp; resume' confirmation to the 10-step listing wizard (the caption promises it — verify it persists).</w:t>
-      </w:r>
-    </w:p>
-    <w:p>
-      <w:pPr>
-        <w:pStyle w:val="Heading2"/>
-        <w:spacing w:after="120" w:before="240"/>
-      </w:pPr>
-      <w:r>
-        <w:t xml:space="preserve">Validation Improvements</w:t>
-      </w:r>
-    </w:p>
-    <w:p>
-      <w:pPr>
-        <w:pStyle w:val="ListParagraph"/>
-        <w:numPr>
-          <w:ilvl w:val="0"/>
-          <w:numId w:val="1"/>
-        </w:numPr>
-        <w:spacing w:after="40"/>
-      </w:pPr>
-      <w:r>
-        <w:t xml:space="preserve">Enforce and unit-test BD phone format (+8801XXXXXXXXX / 01XXXXXXXXX) on both client and server.</w:t>
-      </w:r>
-    </w:p>
-    <w:p>
-      <w:pPr>
-        <w:pStyle w:val="ListParagraph"/>
-        <w:numPr>
-          <w:ilvl w:val="0"/>
-          <w:numId w:val="1"/>
-        </w:numPr>
-        <w:spacing w:after="40"/>
-      </w:pPr>
-      <w:r>
-        <w:t xml:space="preserve">Add boundary validation on the Pricing step (reject negative / non-numeric rent and deposit).</w:t>
-      </w:r>
-    </w:p>
-    <w:p>
-      <w:pPr>
-        <w:pStyle w:val="ListParagraph"/>
-        <w:numPr>
-          <w:ilvl w:val="0"/>
-          <w:numId w:val="1"/>
-        </w:numPr>
-        <w:spacing w:after="40"/>
-      </w:pPr>
-      <w:r>
-        <w:t xml:space="preserve">Enforce a documented password policy and confirm it is consistent across register and reset flows.</w:t>
-      </w:r>
-    </w:p>
-    <w:p>
-      <w:pPr>
-        <w:pStyle w:val="Heading2"/>
-        <w:spacing w:after="120" w:before="240"/>
-      </w:pPr>
-      <w:r>
-        <w:t xml:space="preserve">Performance Improvements</w:t>
-      </w:r>
-    </w:p>
-    <w:p>
-      <w:pPr>
-        <w:pStyle w:val="ListParagraph"/>
-        <w:numPr>
-          <w:ilvl w:val="0"/>
-          <w:numId w:val="1"/>
-        </w:numPr>
-        <w:spacing w:after="40"/>
-      </w:pPr>
-      <w:r>
-        <w:t xml:space="preserve">Eliminate the 20 console errors on /search — they indicate repeated failed Alpine effect evaluations on every render.</w:t>
-      </w:r>
-    </w:p>
-    <w:p>
-      <w:pPr>
-        <w:pStyle w:val="ListParagraph"/>
-        <w:numPr>
-          <w:ilvl w:val="0"/>
-          <w:numId w:val="1"/>
-        </w:numPr>
-        <w:spacing w:after="40"/>
-      </w:pPr>
-      <w:r>
-        <w:t xml:space="preserve">Lazy-load property images and the map tile only when the Map view is activated.</w:t>
-      </w:r>
-    </w:p>
-    <w:p>
-      <w:pPr>
-        <w:pStyle w:val="Heading2"/>
-        <w:spacing w:after="120" w:before="240"/>
-      </w:pPr>
-      <w:r>
-        <w:t xml:space="preserve">Security Recommendations</w:t>
-      </w:r>
-    </w:p>
-    <w:p>
-      <w:pPr>
-        <w:pStyle w:val="ListParagraph"/>
-        <w:numPr>
-          <w:ilvl w:val="0"/>
-          <w:numId w:val="1"/>
-        </w:numPr>
-        <w:spacing w:after="40"/>
-      </w:pPr>
-      <w:r>
-        <w:t xml:space="preserve">Set APP_DEBUG=false in any shared/staging/production environment and ship a custom 500 page (fixes BUG-002).</w:t>
-      </w:r>
-    </w:p>
-    <w:p>
-      <w:pPr>
-        <w:pStyle w:val="ListParagraph"/>
-        <w:numPr>
-          <w:ilvl w:val="0"/>
-          <w:numId w:val="1"/>
-        </w:numPr>
-        <w:spacing w:after="40"/>
-      </w:pPr>
-      <w:r>
-        <w:t xml:space="preserve">Confirm passwords are hashed (observed bcrypt-style hash — keep it) and never logged.</w:t>
-      </w:r>
-    </w:p>
-    <w:p>
-      <w:pPr>
-        <w:pStyle w:val="ListParagraph"/>
-        <w:numPr>
-          <w:ilvl w:val="0"/>
-          <w:numId w:val="1"/>
-        </w:numPr>
-        <w:spacing w:after="40"/>
-      </w:pPr>
-      <w:r>
-        <w:t xml:space="preserve">Add automated checks for IDOR on owner listing edit/delete and for CSRF on all state-changing POSTs.</w:t>
-      </w:r>
-    </w:p>
-    <w:p>
-      <w:pPr>
-        <w:pStyle w:val="ListParagraph"/>
-        <w:numPr>
-          <w:ilvl w:val="0"/>
-          <w:numId w:val="1"/>
-        </w:numPr>
-        <w:spacing w:after="40"/>
-      </w:pPr>
-      <w:r>
-        <w:t xml:space="preserve">Verify banned users are rejected at login and existing sessions are invalidated.</w:t>
-      </w:r>
-    </w:p>
-    <w:p>
-      <w:pPr>
-        <w:pStyle w:val="Heading2"/>
-        <w:spacing w:after="120" w:before="240"/>
-      </w:pPr>
-      <w:r>
-        <w:t xml:space="preserve">Automation Recommendations</w:t>
-      </w:r>
-    </w:p>
-    <w:p>
-      <w:pPr>
-        <w:pStyle w:val="ListParagraph"/>
-        <w:numPr>
-          <w:ilvl w:val="0"/>
-          <w:numId w:val="1"/>
-        </w:numPr>
-        <w:spacing w:after="40"/>
-      </w:pPr>
-      <w:r>
-        <w:t xml:space="preserve">Adopt this POM suite (pages = locators, actions = logic, specs = assertions) as the regression baseline; wire it into CI.</w:t>
-      </w:r>
-    </w:p>
-    <w:p>
-      <w:pPr>
-        <w:pStyle w:val="ListParagraph"/>
-        <w:numPr>
-          <w:ilvl w:val="0"/>
-          <w:numId w:val="1"/>
-        </w:numPr>
-        <w:spacing w:after="40"/>
-      </w:pPr>
-      <w:r>
-        <w:t xml:space="preserve">Add data-testid attributes to key controls (price slider, wizard steps, result cards) to harden selectors.</w:t>
-      </w:r>
-    </w:p>
-    <w:p>
-      <w:pPr>
-        <w:pStyle w:val="ListParagraph"/>
-        <w:numPr>
-          <w:ilvl w:val="0"/>
-          <w:numId w:val="1"/>
-        </w:numPr>
-        <w:spacing w:after="40"/>
-      </w:pPr>
-      <w:r>
-        <w:t xml:space="preserve">Seed a pre-verified renter via a factory/seeder so authenticated renter journeys can be automated despite BUG-001.</w:t>
-      </w:r>
-    </w:p>
-    <w:p>
-      <w:pPr>
-        <w:pStyle w:val="ListParagraph"/>
-        <w:numPr>
-          <w:ilvl w:val="0"/>
-          <w:numId w:val="1"/>
-        </w:numPr>
-        <w:spacing w:after="40"/>
-      </w:pPr>
-      <w:r>
-        <w:t xml:space="preserve">Add visual-regression and accessibility (axe) checks to the guest browsing specs.</w:t>
-      </w:r>
-    </w:p>
-    <w:p>
-      <w:pPr>
-        <w:pStyle w:val="Heading2"/>
-        <w:spacing w:after="120" w:before="240"/>
-      </w:pPr>
-      <w:r>
-        <w:t xml:space="preserve">Maintainability Suggestions</w:t>
-      </w:r>
-    </w:p>
-    <w:p>
-      <w:pPr>
-        <w:pStyle w:val="ListParagraph"/>
-        <w:numPr>
-          <w:ilvl w:val="0"/>
-          <w:numId w:val="1"/>
-        </w:numPr>
-        <w:spacing w:after="40"/>
-      </w:pPr>
-      <w:r>
-        <w:t xml:space="preserve">Keep test-case inventory in data/testcases.js as the single source for Excel + report + specs (already done).</w:t>
-      </w:r>
-    </w:p>
-    <w:p>
-      <w:pPr>
-        <w:pStyle w:val="ListParagraph"/>
-        <w:numPr>
-          <w:ilvl w:val="0"/>
-          <w:numId w:val="1"/>
-        </w:numPr>
-        <w:spacing w:after="40"/>
-      </w:pPr>
-      <w:r>
-        <w:t xml:space="preserve">Pin the seeded slugs/credentials in config so specs do not hard-code environment data.</w:t>
-      </w:r>
-    </w:p>
-    <w:p>
-      <w:pPr>
-        <w:pStyle w:val="ListParagraph"/>
-        <w:numPr>
-          <w:ilvl w:val="0"/>
-          <w:numId w:val="1"/>
-        </w:numPr>
-        <w:spacing w:after="40"/>
-      </w:pPr>
-      <w:r>
-        <w:t xml:space="preserve">Run the suite headless in CI with the html + json reporters archived as build artifacts.</w:t>
-      </w:r>
-    </w:p>
-    <w:p>
-      <w:pPr>
-        <w:pStyle w:val="Heading1"/>
-        <w:spacing w:after="120" w:before="240"/>
-      </w:pPr>
-      <w:r>
-        <w:t xml:space="preserve">5. Risk Assessment</w:t>
-      </w:r>
-    </w:p>
-    <w:p>
-      <w:pPr>
-        <w:spacing w:after="60" w:before="160"/>
+        <w:spacing w:after="80" w:before="200"/>
       </w:pPr>
       <w:r>
         <w:rPr>
           <w:b/>
           <w:bCs/>
           <w:color w:val="C62828"/>
+          <w:sz w:val="26"/>
+          <w:szCs w:val="26"/>
+        </w:rPr>
+        <w:t xml:space="preserve">BUG-004 — Search filters silently accept invalid input (negative / non-numeric / out-of-range) instead of validating it</w:t>
+      </w:r>
+    </w:p>
+    <w:tbl>
+      <w:tblPr>
+        <w:tblW w:type="pct" w:w="100%"/>
+        <w:tblBorders>
+          <w:top w:val="single" w:color="BBBBBB" w:sz="1"/>
+          <w:left w:val="single" w:color="BBBBBB" w:sz="1"/>
+          <w:bottom w:val="single" w:color="BBBBBB" w:sz="1"/>
+          <w:right w:val="single" w:color="BBBBBB" w:sz="1"/>
+          <w:insideH w:val="single" w:color="BBBBBB" w:sz="1"/>
+          <w:insideV w:val="single" w:color="BBBBBB" w:sz="1"/>
+        </w:tblBorders>
+      </w:tblPr>
+      <w:tblGrid>
+        <w:gridCol w:w="100"/>
+        <w:gridCol w:w="100"/>
+        <w:gridCol w:w="100"/>
+        <w:gridCol w:w="100"/>
+      </w:tblGrid>
+      <w:tr>
+        <w:tc>
+          <w:tcPr>
+            <w:tcW w:type="pct" w:w="20%"/>
+            <w:shd w:fill="F2F2F2" w:val="clear"/>
+          </w:tcPr>
+          <w:p>
+            <w:r>
+              <w:rPr>
+                <w:b/>
+                <w:bCs/>
+              </w:rPr>
+              <w:t xml:space="preserve">Severity</w:t>
+            </w:r>
+          </w:p>
+        </w:tc>
+        <w:tc>
+          <w:p>
+            <w:r>
+              <w:rPr>
+                <w:b w:val="false"/>
+                <w:bCs w:val="false"/>
+              </w:rPr>
+              <w:t xml:space="preserve">Low</w:t>
+            </w:r>
+          </w:p>
+        </w:tc>
+        <w:tc>
+          <w:tcPr>
+            <w:tcW w:type="pct" w:w="15%"/>
+            <w:shd w:fill="F2F2F2" w:val="clear"/>
+          </w:tcPr>
+          <w:p>
+            <w:r>
+              <w:rPr>
+                <w:b/>
+                <w:bCs/>
+              </w:rPr>
+              <w:t xml:space="preserve">Priority</w:t>
+            </w:r>
+          </w:p>
+        </w:tc>
+        <w:tc>
+          <w:p>
+            <w:r>
+              <w:rPr>
+                <w:b w:val="false"/>
+                <w:bCs w:val="false"/>
+              </w:rPr>
+              <w:t xml:space="preserve">P3</w:t>
+            </w:r>
+          </w:p>
+        </w:tc>
+      </w:tr>
+      <w:tr>
+        <w:tc>
+          <w:tcPr>
+            <w:shd w:fill="F2F2F2" w:val="clear"/>
+          </w:tcPr>
+          <w:p>
+            <w:r>
+              <w:rPr>
+                <w:b/>
+                <w:bCs/>
+              </w:rPr>
+              <w:t xml:space="preserve">Module</w:t>
+            </w:r>
+          </w:p>
+        </w:tc>
+        <w:tc>
+          <w:p>
+            <w:r>
+              <w:rPr>
+                <w:b w:val="false"/>
+                <w:bCs w:val="false"/>
+              </w:rPr>
+              <w:t xml:space="preserve">Search &amp; Discovery</w:t>
+            </w:r>
+          </w:p>
+        </w:tc>
+        <w:tc>
+          <w:tcPr>
+            <w:shd w:fill="F2F2F2" w:val="clear"/>
+          </w:tcPr>
+          <w:p>
+            <w:r>
+              <w:rPr>
+                <w:b/>
+                <w:bCs/>
+              </w:rPr>
+              <w:t xml:space="preserve">Linked TCs</w:t>
+            </w:r>
+          </w:p>
+        </w:tc>
+        <w:tc>
+          <w:p>
+            <w:r>
+              <w:rPr>
+                <w:b w:val="false"/>
+                <w:bCs w:val="false"/>
+              </w:rPr>
+              <w:t xml:space="preserve">EDGE-02, EDGE-03, BVA-07</w:t>
+            </w:r>
+          </w:p>
+        </w:tc>
+      </w:tr>
+    </w:tbl>
+    <w:p>
+      <w:pPr>
+        <w:spacing w:after="80"/>
+      </w:pPr>
+      <w:r>
+        <w:rPr>
+          <w:b/>
+          <w:bCs/>
+        </w:rPr>
+        <w:t xml:space="preserve">Preconditions:</w:t>
+      </w:r>
+    </w:p>
+    <w:p>
+      <w:pPr>
+        <w:spacing w:after="80"/>
+      </w:pPr>
+      <w:r>
+        <w:t xml:space="preserve">Guest on http://127.0.0.1:8000/search.</w:t>
+      </w:r>
+    </w:p>
+    <w:p>
+      <w:pPr>
+        <w:spacing w:after="80"/>
+      </w:pPr>
+      <w:r>
+        <w:rPr>
+          <w:b/>
+          <w:bCs/>
+        </w:rPr>
+        <w:t xml:space="preserve">Steps to Reproduce:</w:t>
+      </w:r>
+    </w:p>
+    <w:p>
+      <w:pPr>
+        <w:spacing w:after="30"/>
+      </w:pPr>
+      <w:r>
+        <w:t xml:space="preserve">1. Open /search?min_price=-100 (negative lower bound)</w:t>
+      </w:r>
+    </w:p>
+    <w:p>
+      <w:pPr>
+        <w:spacing w:after="30"/>
+      </w:pPr>
+      <w:r>
+        <w:t xml:space="preserve">2. Open /search?min_price=abc (non-numeric)</w:t>
+      </w:r>
+    </w:p>
+    <w:p>
+      <w:pPr>
+        <w:spacing w:after="30"/>
+      </w:pPr>
+      <w:r>
+        <w:t xml:space="preserve">3. Open /search?max_price=0 (zero ceiling)</w:t>
+      </w:r>
+    </w:p>
+    <w:p>
+      <w:pPr>
+        <w:spacing w:after="30"/>
+      </w:pPr>
+      <w:r>
+        <w:t xml:space="preserve">4. Read the 'N rentals found' counter for each</w:t>
+      </w:r>
+    </w:p>
+    <w:p>
+      <w:pPr>
+        <w:spacing w:after="80"/>
+      </w:pPr>
+      <w:r>
+        <w:rPr>
+          <w:b/>
+          <w:bCs/>
+        </w:rPr>
+        <w:t xml:space="preserve">Expected Result:</w:t>
+      </w:r>
+    </w:p>
+    <w:p>
+      <w:pPr>
+        <w:spacing w:after="80"/>
+      </w:pPr>
+      <w:r>
+        <w:t xml:space="preserve">Invalid or out-of-range filter values are rejected or normalised with visible feedback (e.g. ignored AND flagged, or an HTTP 422), so the user understands their filter was not applied.</w:t>
+      </w:r>
+    </w:p>
+    <w:p>
+      <w:pPr>
+        <w:spacing w:after="80"/>
+      </w:pPr>
+      <w:r>
+        <w:rPr>
+          <w:b/>
+          <w:bCs/>
+          <w:color w:val="C62828"/>
+        </w:rPr>
+        <w:t xml:space="preserve">Actual Result:</w:t>
+      </w:r>
+    </w:p>
+    <w:p>
+      <w:pPr>
+        <w:spacing w:after="80"/>
+      </w:pPr>
+      <w:r>
+        <w:t xml:space="preserve">All three return HTTP 200 and silently drop the filter: min_price=-100 and min_price=abc each return the full catalogue (8 of 8) as if no filter were set, and max_price=0 is interpreted as 'no maximum' (8 of 8) rather than 'rent ≤ 0' (which would be 0). The query string still carries the bogus value, so the result set contradicts the apparent filter with no message. Behaviour is graceful (no crash) but unvalidated — a data-quality / UX-correctness gap on the primary discovery surface.</w:t>
+      </w:r>
+    </w:p>
+    <w:p>
+      <w:pPr>
+        <w:spacing w:after="80"/>
+      </w:pPr>
+      <w:r>
+        <w:rPr>
+          <w:b/>
+          <w:bCs/>
+        </w:rPr>
+        <w:t xml:space="preserve">Supporting Evidence:</w:t>
+      </w:r>
+    </w:p>
+    <w:p>
+      <w:pPr>
+        <w:spacing w:after="80"/>
+      </w:pPr>
+      <w:r>
+        <w:rPr>
+          <w:i/>
+          <w:iCs/>
+        </w:rPr>
+        <w:t xml:space="preserve">Probed live: /search?min_price=-100 → '8 rentals found'; /search?min_price=abc → '8 rentals found'; /search?max_price=0 → '8 rentals found'. Compare the valid boundary /search?min_price=6001 → '7 rentals found'. Demonstrated by automated EDGE-02, EDGE-03 (graceful-handling assertions) and BVA-07.</w:t>
+      </w:r>
+    </w:p>
+    <w:p>
+      <w:pPr>
+        <w:spacing w:after="80"/>
+      </w:pPr>
+      <w:r>
+        <w:rPr>
+          <w:b/>
+          <w:bCs/>
+        </w:rPr>
+        <w:t xml:space="preserve">Screenshot:</w:t>
+      </w:r>
+    </w:p>
+    <w:p>
+      <w:pPr>
+        <w:spacing w:after="120"/>
+      </w:pPr>
+      <w:r>
+        <w:drawing>
+          <wp:inline distT="0" distB="0" distL="0" distR="0">
+            <wp:extent cx="5334000" cy="3048000"/>
+            <wp:effectExtent t="0" r="0" b="0" l="0"/>
+            <wp:docPr id="1" name="" descr="" title=""/>
+            <wp:cNvGraphicFramePr>
+              <a:graphicFrameLocks xmlns:a="http://schemas.openxmlformats.org/drawingml/2006/main" noChangeAspect="1"/>
+            </wp:cNvGraphicFramePr>
+            <a:graphic xmlns:a="http://schemas.openxmlformats.org/drawingml/2006/main">
+              <a:graphicData uri="http://schemas.openxmlformats.org/drawingml/2006/picture">
+                <pic:pic xmlns:pic="http://schemas.openxmlformats.org/drawingml/2006/picture">
+                  <pic:nvPicPr>
+                    <pic:cNvPr id="0" name="" descr=""/>
+                    <pic:cNvPicPr>
+                      <a:picLocks noChangeAspect="1" noChangeArrowheads="1"/>
+                    </pic:cNvPicPr>
+                  </pic:nvPicPr>
+                  <pic:blipFill>
+                    <a:blip r:embed="rId9" cstate="none"/>
+                    <a:srcRect/>
+                    <a:stretch>
+                      <a:fillRect/>
+                    </a:stretch>
+                  </pic:blipFill>
+                  <pic:spPr bwMode="auto">
+                    <a:xfrm>
+                      <a:off x="0" y="0"/>
+                      <a:ext cx="5334000" cy="3048000"/>
+                    </a:xfrm>
+                    <a:prstGeom prst="rect">
+                      <a:avLst/>
+                    </a:prstGeom>
+                  </pic:spPr>
+                </pic:pic>
+              </a:graphicData>
+            </a:graphic>
+          </wp:inline>
+        </w:drawing>
+      </w:r>
+    </w:p>
+    <w:p>
+      <w:pPr>
+        <w:pStyle w:val="Heading1"/>
+        <w:spacing w:after="120" w:before="240"/>
+      </w:pPr>
+      <w:r>
+        <w:t xml:space="preserve">4. Improvement Recommendations</w:t>
+      </w:r>
+    </w:p>
+    <w:p>
+      <w:pPr>
+        <w:pStyle w:val="Heading2"/>
+        <w:spacing w:after="120" w:before="240"/>
+      </w:pPr>
+      <w:r>
+        <w:t xml:space="preserve">UX Improvements</w:t>
+      </w:r>
+    </w:p>
+    <w:p>
+      <w:pPr>
+        <w:pStyle w:val="ListParagraph"/>
+        <w:numPr>
+          <w:ilvl w:val="0"/>
+          <w:numId w:val="1"/>
+        </w:numPr>
+        <w:spacing w:after="40"/>
+      </w:pPr>
+      <w:r>
+        <w:t xml:space="preserve">Show inline, field-level validation messages on register/login instead of relying on full-page reloads.</w:t>
+      </w:r>
+    </w:p>
+    <w:p>
+      <w:pPr>
+        <w:pStyle w:val="ListParagraph"/>
+        <w:numPr>
+          <w:ilvl w:val="0"/>
+          <w:numId w:val="1"/>
+        </w:numPr>
+        <w:spacing w:after="40"/>
+      </w:pPr>
+      <w:r>
+        <w:t xml:space="preserve">Provide a visible empty-state and active-filter chips on /search so users understand why results changed.</w:t>
+      </w:r>
+    </w:p>
+    <w:p>
+      <w:pPr>
+        <w:pStyle w:val="ListParagraph"/>
+        <w:numPr>
+          <w:ilvl w:val="0"/>
+          <w:numId w:val="1"/>
+        </w:numPr>
+        <w:spacing w:after="40"/>
+      </w:pPr>
+      <w:r>
+        <w:t xml:space="preserve">Surface the property 'views' counter and 'available from' date more prominently on cards.</w:t>
+      </w:r>
+    </w:p>
+    <w:p>
+      <w:pPr>
+        <w:pStyle w:val="Heading2"/>
+        <w:spacing w:after="120" w:before="240"/>
+      </w:pPr>
+      <w:r>
+        <w:t xml:space="preserve">Workflow Improvements</w:t>
+      </w:r>
+    </w:p>
+    <w:p>
+      <w:pPr>
+        <w:pStyle w:val="ListParagraph"/>
+        <w:numPr>
+          <w:ilvl w:val="0"/>
+          <w:numId w:val="1"/>
+        </w:numPr>
+        <w:spacing w:after="40"/>
+      </w:pPr>
+      <w:r>
+        <w:t xml:space="preserve">Decouple email sending from the registration transaction — queue the verification email so a mail failure never blocks account creation (fixes BUG-001's blast radius).</w:t>
+      </w:r>
+    </w:p>
+    <w:p>
+      <w:pPr>
+        <w:pStyle w:val="ListParagraph"/>
+        <w:numPr>
+          <w:ilvl w:val="0"/>
+          <w:numId w:val="1"/>
+        </w:numPr>
+        <w:spacing w:after="40"/>
+      </w:pPr>
+      <w:r>
+        <w:t xml:space="preserve">Allow renters limited browsing before email verification; gate only owner-contact actions behind verification.</w:t>
+      </w:r>
+    </w:p>
+    <w:p>
+      <w:pPr>
+        <w:pStyle w:val="ListParagraph"/>
+        <w:numPr>
+          <w:ilvl w:val="0"/>
+          <w:numId w:val="1"/>
+        </w:numPr>
+        <w:spacing w:after="40"/>
+      </w:pPr>
+      <w:r>
+        <w:t xml:space="preserve">Add a 'save &amp; resume' confirmation to the 10-step listing wizard (the caption promises it — verify it persists).</w:t>
+      </w:r>
+    </w:p>
+    <w:p>
+      <w:pPr>
+        <w:pStyle w:val="Heading2"/>
+        <w:spacing w:after="120" w:before="240"/>
+      </w:pPr>
+      <w:r>
+        <w:t xml:space="preserve">Validation Improvements</w:t>
+      </w:r>
+    </w:p>
+    <w:p>
+      <w:pPr>
+        <w:pStyle w:val="ListParagraph"/>
+        <w:numPr>
+          <w:ilvl w:val="0"/>
+          <w:numId w:val="1"/>
+        </w:numPr>
+        <w:spacing w:after="40"/>
+      </w:pPr>
+      <w:r>
+        <w:t xml:space="preserve">Enforce and unit-test BD phone format (+8801XXXXXXXXX / 01XXXXXXXXX) on both client and server.</w:t>
+      </w:r>
+    </w:p>
+    <w:p>
+      <w:pPr>
+        <w:pStyle w:val="ListParagraph"/>
+        <w:numPr>
+          <w:ilvl w:val="0"/>
+          <w:numId w:val="1"/>
+        </w:numPr>
+        <w:spacing w:after="40"/>
+      </w:pPr>
+      <w:r>
+        <w:t xml:space="preserve">Add boundary validation on the Pricing step (reject negative / non-numeric rent and deposit).</w:t>
+      </w:r>
+    </w:p>
+    <w:p>
+      <w:pPr>
+        <w:pStyle w:val="ListParagraph"/>
+        <w:numPr>
+          <w:ilvl w:val="0"/>
+          <w:numId w:val="1"/>
+        </w:numPr>
+        <w:spacing w:after="40"/>
+      </w:pPr>
+      <w:r>
+        <w:t xml:space="preserve">Enforce a documented password policy and confirm it is consistent across register and reset flows.</w:t>
+      </w:r>
+    </w:p>
+    <w:p>
+      <w:pPr>
+        <w:pStyle w:val="ListParagraph"/>
+        <w:numPr>
+          <w:ilvl w:val="0"/>
+          <w:numId w:val="1"/>
+        </w:numPr>
+        <w:spacing w:after="40"/>
+      </w:pPr>
+      <w:r>
+        <w:t xml:space="preserve">Harden /search filter inputs surfaced by the BVA/EP pass: negative and non-numeric min_price are silently ignored (HTTP 200) instead of validated, max_price=0 is interpreted as 'no maximum', and bedrooms beyond the offered 4+ partition return empty — document or reject these out-of-range partitions explicitly.</w:t>
+      </w:r>
+    </w:p>
+    <w:p>
+      <w:pPr>
+        <w:pStyle w:val="Heading2"/>
+        <w:spacing w:after="120" w:before="240"/>
+      </w:pPr>
+      <w:r>
+        <w:t xml:space="preserve">Performance Improvements</w:t>
+      </w:r>
+    </w:p>
+    <w:p>
+      <w:pPr>
+        <w:pStyle w:val="ListParagraph"/>
+        <w:numPr>
+          <w:ilvl w:val="0"/>
+          <w:numId w:val="1"/>
+        </w:numPr>
+        <w:spacing w:after="40"/>
+      </w:pPr>
+      <w:r>
+        <w:t xml:space="preserve">Eliminate the 20 console errors on /search — they indicate repeated failed Alpine effect evaluations on every render.</w:t>
+      </w:r>
+    </w:p>
+    <w:p>
+      <w:pPr>
+        <w:pStyle w:val="ListParagraph"/>
+        <w:numPr>
+          <w:ilvl w:val="0"/>
+          <w:numId w:val="1"/>
+        </w:numPr>
+        <w:spacing w:after="40"/>
+      </w:pPr>
+      <w:r>
+        <w:t xml:space="preserve">Lazy-load property images and the map tile only when the Map view is activated.</w:t>
+      </w:r>
+    </w:p>
+    <w:p>
+      <w:pPr>
+        <w:pStyle w:val="Heading2"/>
+        <w:spacing w:after="120" w:before="240"/>
+      </w:pPr>
+      <w:r>
+        <w:t xml:space="preserve">Security Recommendations</w:t>
+      </w:r>
+    </w:p>
+    <w:p>
+      <w:pPr>
+        <w:pStyle w:val="ListParagraph"/>
+        <w:numPr>
+          <w:ilvl w:val="0"/>
+          <w:numId w:val="1"/>
+        </w:numPr>
+        <w:spacing w:after="40"/>
+      </w:pPr>
+      <w:r>
+        <w:t xml:space="preserve">Set APP_DEBUG=false in any shared/staging/production environment and ship a custom 500 page (fixes BUG-002).</w:t>
+      </w:r>
+    </w:p>
+    <w:p>
+      <w:pPr>
+        <w:pStyle w:val="ListParagraph"/>
+        <w:numPr>
+          <w:ilvl w:val="0"/>
+          <w:numId w:val="1"/>
+        </w:numPr>
+        <w:spacing w:after="40"/>
+      </w:pPr>
+      <w:r>
+        <w:t xml:space="preserve">Confirm passwords are hashed (observed bcrypt-style hash — keep it) and never logged.</w:t>
+      </w:r>
+    </w:p>
+    <w:p>
+      <w:pPr>
+        <w:pStyle w:val="ListParagraph"/>
+        <w:numPr>
+          <w:ilvl w:val="0"/>
+          <w:numId w:val="1"/>
+        </w:numPr>
+        <w:spacing w:after="40"/>
+      </w:pPr>
+      <w:r>
+        <w:t xml:space="preserve">Add automated checks for IDOR on owner listing edit/delete and for CSRF on all state-changing POSTs.</w:t>
+      </w:r>
+    </w:p>
+    <w:p>
+      <w:pPr>
+        <w:pStyle w:val="ListParagraph"/>
+        <w:numPr>
+          <w:ilvl w:val="0"/>
+          <w:numId w:val="1"/>
+        </w:numPr>
+        <w:spacing w:after="40"/>
+      </w:pPr>
+      <w:r>
+        <w:t xml:space="preserve">Verify banned users are rejected at login and existing sessions are invalidated.</w:t>
+      </w:r>
+    </w:p>
+    <w:p>
+      <w:pPr>
+        <w:pStyle w:val="Heading2"/>
+        <w:spacing w:after="120" w:before="240"/>
+      </w:pPr>
+      <w:r>
+        <w:t xml:space="preserve">Automation Recommendations</w:t>
+      </w:r>
+    </w:p>
+    <w:p>
+      <w:pPr>
+        <w:pStyle w:val="ListParagraph"/>
+        <w:numPr>
+          <w:ilvl w:val="0"/>
+          <w:numId w:val="1"/>
+        </w:numPr>
+        <w:spacing w:after="40"/>
+      </w:pPr>
+      <w:r>
+        <w:t xml:space="preserve">Adopt this POM suite (pages = locators, actions = logic, specs = assertions) as the regression baseline; wire it into CI.</w:t>
+      </w:r>
+    </w:p>
+    <w:p>
+      <w:pPr>
+        <w:pStyle w:val="ListParagraph"/>
+        <w:numPr>
+          <w:ilvl w:val="0"/>
+          <w:numId w:val="1"/>
+        </w:numPr>
+        <w:spacing w:after="40"/>
+      </w:pPr>
+      <w:r>
+        <w:t xml:space="preserve">Add data-testid attributes to key controls (price slider, wizard steps, result cards) to harden selectors.</w:t>
+      </w:r>
+    </w:p>
+    <w:p>
+      <w:pPr>
+        <w:pStyle w:val="ListParagraph"/>
+        <w:numPr>
+          <w:ilvl w:val="0"/>
+          <w:numId w:val="1"/>
+        </w:numPr>
+        <w:spacing w:after="40"/>
+      </w:pPr>
+      <w:r>
+        <w:t xml:space="preserve">Seed a pre-verified renter via a factory/seeder so authenticated renter journeys can be automated despite BUG-001.</w:t>
+      </w:r>
+    </w:p>
+    <w:p>
+      <w:pPr>
+        <w:pStyle w:val="ListParagraph"/>
+        <w:numPr>
+          <w:ilvl w:val="0"/>
+          <w:numId w:val="1"/>
+        </w:numPr>
+        <w:spacing w:after="40"/>
+      </w:pPr>
+      <w:r>
+        <w:t xml:space="preserve">Add visual-regression and accessibility (axe) checks to the guest browsing specs.</w:t>
+      </w:r>
+    </w:p>
+    <w:p>
+      <w:pPr>
+        <w:pStyle w:val="Heading2"/>
+        <w:spacing w:after="120" w:before="240"/>
+      </w:pPr>
+      <w:r>
+        <w:t xml:space="preserve">Maintainability Suggestions</w:t>
+      </w:r>
+    </w:p>
+    <w:p>
+      <w:pPr>
+        <w:pStyle w:val="ListParagraph"/>
+        <w:numPr>
+          <w:ilvl w:val="0"/>
+          <w:numId w:val="1"/>
+        </w:numPr>
+        <w:spacing w:after="40"/>
+      </w:pPr>
+      <w:r>
+        <w:t xml:space="preserve">Keep test-case inventory in data/testcases.js as the single source for Excel + report + specs (already done).</w:t>
+      </w:r>
+    </w:p>
+    <w:p>
+      <w:pPr>
+        <w:pStyle w:val="ListParagraph"/>
+        <w:numPr>
+          <w:ilvl w:val="0"/>
+          <w:numId w:val="1"/>
+        </w:numPr>
+        <w:spacing w:after="40"/>
+      </w:pPr>
+      <w:r>
+        <w:t xml:space="preserve">Pin the seeded slugs/credentials in config so specs do not hard-code environment data.</w:t>
+      </w:r>
+    </w:p>
+    <w:p>
+      <w:pPr>
+        <w:pStyle w:val="ListParagraph"/>
+        <w:numPr>
+          <w:ilvl w:val="0"/>
+          <w:numId w:val="1"/>
+        </w:numPr>
+        <w:spacing w:after="40"/>
+      </w:pPr>
+      <w:r>
+        <w:t xml:space="preserve">Run the suite headless in CI with the html + json reporters archived as build artifacts.</w:t>
+      </w:r>
+    </w:p>
+    <w:p>
+      <w:pPr>
+        <w:pStyle w:val="Heading1"/>
+        <w:spacing w:after="120" w:before="240"/>
+      </w:pPr>
+      <w:r>
+        <w:t xml:space="preserve">5. Risk Assessment</w:t>
+      </w:r>
+    </w:p>
+    <w:p>
+      <w:pPr>
+        <w:spacing w:after="60" w:before="160"/>
+      </w:pPr>
+      <w:r>
+        <w:rPr>
+          <w:b/>
+          <w:bCs/>
+          <w:color w:val="C62828"/>
         </w:rPr>
         <w:t xml:space="preserve">High-Risk Areas</w:t>
       </w:r>
@@ -2530,7 +3068,7 @@
         <w:spacing w:after="80"/>
       </w:pPr>
       <w:r>
-        <w:t xml:space="preserve">58 test cases designed across 7 modules; 39 automated (34 passed, 5 failed); 19 manual/E2E cases documented for the next cycle. All 3 defects are reproduced by automated tests and captured with screenshot evidence.</w:t>
+        <w:t xml:space="preserve">182 test cases designed across 10 modules; 163 automated (160 passed, 3 failed); 19 manual/E2E cases documented for the next cycle. All 4 defects are captured with screenshot evidence; the functional/blocking defects (BUG-001/002/003) are reproduced by failing automated tests, and BUG-004 is demonstrated by the EP/BVA edge cases.</w:t>
       </w:r>
     </w:p>
     <w:sectPr>

</xml_diff>